<commit_message>
major fixes on every user level
</commit_message>
<xml_diff>
--- a/backend/templates/DailyReports.docx
+++ b/backend/templates/DailyReports.docx
@@ -19,7 +19,16 @@
           <w:sz w:val="28"/>
           <w:szCs w:val="28"/>
         </w:rPr>
-        <w:t>Daily Attendance Report ({</w:t>
+        <w:t>Monthly</w:t>
+      </w:r>
+      <w:r>
+        <w:rPr>
+          <w:b/>
+          <w:bCs/>
+          <w:sz w:val="28"/>
+          <w:szCs w:val="28"/>
+        </w:rPr>
+        <w:t xml:space="preserve"> Attendance Report ({</w:t>
       </w:r>
       <w:proofErr w:type="spellStart"/>
       <w:r>
@@ -377,7 +386,6 @@
       <w:tc>
         <w:tcPr>
           <w:tcW w:w="7701" w:type="dxa"/>
-          <w:shd w:val="clear" w:color="auto" w:fill="auto"/>
         </w:tcPr>
         <w:p>
           <w:pPr>
@@ -403,7 +411,6 @@
       <w:tc>
         <w:tcPr>
           <w:tcW w:w="7701" w:type="dxa"/>
-          <w:shd w:val="clear" w:color="auto" w:fill="auto"/>
         </w:tcPr>
         <w:p>
           <w:pPr>
@@ -543,7 +550,6 @@
       <w:tc>
         <w:tcPr>
           <w:tcW w:w="7701" w:type="dxa"/>
-          <w:shd w:val="clear" w:color="auto" w:fill="auto"/>
         </w:tcPr>
         <w:p>
           <w:pPr>
@@ -590,7 +596,6 @@
       <w:tc>
         <w:tcPr>
           <w:tcW w:w="7701" w:type="dxa"/>
-          <w:shd w:val="clear" w:color="auto" w:fill="auto"/>
         </w:tcPr>
         <w:p>
           <w:pPr>
@@ -650,7 +655,6 @@
       <w:tc>
         <w:tcPr>
           <w:tcW w:w="11645" w:type="dxa"/>
-          <w:shd w:val="clear" w:color="auto" w:fill="auto"/>
         </w:tcPr>
         <w:p>
           <w:bookmarkStart w:id="0" w:name="_Hlk517895093"/>
@@ -1250,7 +1254,6 @@
                             <w:tc>
                               <w:tcPr>
                                 <w:tcW w:w="6408" w:type="dxa"/>
-                                <w:shd w:val="clear" w:color="auto" w:fill="auto"/>
                               </w:tcPr>
                               <w:p>
                                 <w:pPr>
@@ -1336,7 +1339,6 @@
                       <w:tc>
                         <w:tcPr>
                           <w:tcW w:w="6408" w:type="dxa"/>
-                          <w:shd w:val="clear" w:color="auto" w:fill="auto"/>
                         </w:tcPr>
                         <w:p>
                           <w:pPr>
@@ -1783,6 +1785,7 @@
   <w:style w:type="character" w:default="1" w:styleId="DefaultParagraphFont">
     <w:name w:val="Default Paragraph Font"/>
     <w:uiPriority w:val="1"/>
+    <w:semiHidden/>
     <w:unhideWhenUsed/>
   </w:style>
   <w:style w:type="table" w:default="1" w:styleId="TableNormal">

</xml_diff>